<commit_message>
feat: build relational curated tables for August pilot
</commit_message>
<xml_diff>
--- a/docs/generated/ARCHITECTURE.en.docx
+++ b/docs/generated/ARCHITECTURE.en.docx
@@ -80,11 +80,15 @@
         <w:br/>
         <w:t xml:space="preserve">    subgraph S4["4. ML-Ready Curated Relational Layer"]</w:t>
         <w:br/>
-        <w:t xml:space="preserve">        H --&gt; L["Relational Separation&lt;br/&gt;(tenders, bidder_submissions, award_outcomes, contracts)"]</w:t>
+        <w:t xml:space="preserve">        H --&gt; L["Load Processed Parquet Feeds&lt;br/&gt;(bids, awards, contracts)"]</w:t>
         <w:br/>
-        <w:t xml:space="preserve">        L --&gt; N["Dimension &amp; Bridge Mapping&lt;br/&gt;(suppliers, agencies, tender_contract_bridge)"]</w:t>
+        <w:t xml:space="preserve">        L --&gt; M1["Curation Engine&lt;br/&gt;(scripts/build_curated.py&lt;br/&gt;src/koneps_intel/curate.py)"]</w:t>
         <w:br/>
-        <w:t xml:space="preserve">        N --&gt; P["Kaggle Dataset Publication&lt;br/&gt;(Partitioned Parquet + Zstandard)"]</w:t>
+        <w:t xml:space="preserve">        M1 --&gt; N["Mathematical Reconciliation Gates&lt;br/&gt;(validate_curated_tables)"]</w:t>
+        <w:br/>
+        <w:t xml:space="preserve">        N --&gt; O["7 Curated Relational Tables&lt;br/&gt;(tenders, submissions, awards,&lt;br/&gt;contracts, suppliers, agencies, bridge)"]</w:t>
+        <w:br/>
+        <w:t xml:space="preserve">        O --&gt; P["Public Metrics Snapshot&lt;br/&gt;(docs/metrics/curated_YYYY_MM.json)"]</w:t>
         <w:br/>
         <w:t xml:space="preserve">    end</w:t>
       </w:r>
@@ -327,6 +331,54 @@
       </w:pPr>
       <w:r>
         <w:t>Tender Notice (tenders) 1 → 0..N Contracts (contracts): notice-linked contracts (35.08%), off-notice private/direct contracts (64.92%).</w:t>
+      </w:r>
+    </w:p>
+    <w:p>
+      <w:pPr>
+        <w:pStyle w:val="Heading2"/>
+      </w:pPr>
+      <w:r>
+        <w:t>6. Curated Relational &amp; Privacy Preservation</w:t>
+      </w:r>
+    </w:p>
+    <w:p>
+      <w:pPr>
+        <w:pStyle w:val="ListBullet"/>
+      </w:pPr>
+      <w:r>
+        <w:t>CURATED_SCHEMA_VERSION = "1.0.0": 7 normalized physical curated tables generated under data/processed/curated/YYYY_MM/.</w:t>
+      </w:r>
+    </w:p>
+    <w:p>
+      <w:pPr>
+        <w:pStyle w:val="ListBullet"/>
+      </w:pPr>
+      <w:r>
+        <w:t>Deterministic Surrogate PKs: BID_&lt;32 hex&gt; and AWD_&lt;32 hex&gt; preserve the underlying business grain while enabling O(1) single-column relational joins.</w:t>
+      </w:r>
+    </w:p>
+    <w:p>
+      <w:pPr>
+        <w:pStyle w:val="ListBullet"/>
+      </w:pPr>
+      <w:r>
+        <w:t>Zero PII Guarantee: Raw business registration numbers, representative names, telephone numbers, street addresses, and emails are purged; public releases include HMAC-SHA256 pseudonymized supplier_id and masked masked_biz_no (123-45-*).</w:t>
+      </w:r>
+    </w:p>
+    <w:p>
+      <w:pPr>
+        <w:pStyle w:val="ListBullet"/>
+      </w:pPr>
+      <w:r>
+        <w:t>Secret Key Separation: API access credentials (DATA_GO_KR_SERVICE_KEY) and pseudonymization keys (KONEPS_SUPPLIER_HMAC_KEY) are kept strictly independent.</w:t>
+      </w:r>
+    </w:p>
+    <w:p>
+      <w:pPr>
+        <w:pStyle w:val="ListBullet"/>
+      </w:pPr>
+      <w:r>
+        <w:t>Temporal Foreign Key Tracking: The tender_in_scope: bool flag explicitly tracks cross-period boundary effects without discarding valid bids or contracts.</w:t>
       </w:r>
     </w:p>
     <w:p>

</xml_diff>